<commit_message>
Simplify the pending-transaction steps in 4.2.2
Dropped the CRM follow-up scheduling sub-step and tightened the
remaining wording (2 steps instead of 3), per reviewer simplification.

Co-Authored-By: Claude Sonnet 5 <noreply@anthropic.com>
Claude-Session: https://claude.ai/code/session_01Msiz5p6hoKmmUHZyLJTkqb
</commit_message>
<xml_diff>
--- a/Dispute Resolution/Stage 1 Dispute Intake - Visa Debit Dispute Management Process - DRAFT.docx
+++ b/Dispute Resolution/Stage 1 Dispute Intake - Visa Debit Dispute Management Process - DRAFT.docx
@@ -1916,7 +1916,7 @@
         <w:t xml:space="preserve">If not yet posted: </w:t>
       </w:r>
       <w:r>
-        <w:t>follow Section 4.2.3 — Create the CRM Case, Steps 1–3 only (Case Details, Member Details, Transaction Details), to capture the pending transaction. Do not proceed to Step 4 — Determine Recognition of Transaction until the transaction has posted:</w:t>
+        <w:t>follow Section 4.2.3 — Create the CRM Case, Steps 1–3 only (Case Details, Member Details, Transaction Details), to capture the pending transaction, then:</w:t>
       </w:r>
     </w:p>
     <w:p>
@@ -1931,7 +1931,7 @@
         <w:contextualSpacing w:val="0"/>
       </w:pPr>
       <w:r>
-        <w:t xml:space="preserve">Advise the member that a dispute request cannot be submitted while the transaction remains pending, and that Beem will follow up once it posts.</w:t>
+        <w:t xml:space="preserve">Advise the member that a dispute cannot be submitted while the transaction remains pending, and that Beem will follow up once it posts.</w:t>
       </w:r>
     </w:p>
     <w:p>
@@ -1946,22 +1946,7 @@
         <w:contextualSpacing w:val="0"/>
       </w:pPr>
       <w:r>
-        <w:t xml:space="preserve">Schedule a CRM follow-up to check the transaction’s posting status.</w:t>
-      </w:r>
-    </w:p>
-    <w:p>
-      <w:pPr>
-        <w:pStyle w:val="ListParagraph"/>
-        <w:numPr>
-          <w:ilvl w:val="2"/>
-          <w:numId w:val="22"/>
-        </w:numPr>
-        <w:spacing w:before="120" w:after="120"/>
-        <w:ind w:hanging="357"/>
-        <w:contextualSpacing w:val="0"/>
-      </w:pPr>
-      <w:r>
-        <w:t xml:space="preserve">Once the transaction posts, proactively contact the member and proceed to Section 4.2.3, Step 4, to complete the recognition determination and route the case.</w:t>
+        <w:t xml:space="preserve">Once the transaction posts, proactively contact the member and proceed to Section 4.2.3, Step 4, to determine recognition and route the case.</w:t>
       </w:r>
     </w:p>
     <w:p>

</xml_diff>

<commit_message>
Resolve member-authentication reference with named procedures
Replaces the [TBC] placeholder in 4.2.1 with the two actual authentication
procedures by channel: the Member Connect Authentication Procedure for
Contact Centre, and the Branch Authentication Procedure for Branch.

Co-Authored-By: Claude Sonnet 5 <noreply@anthropic.com>
Claude-Session: https://claude.ai/code/session_01Msiz5p6hoKmmUHZyLJTkqb
</commit_message>
<xml_diff>
--- a/Dispute Resolution/Stage 1 Dispute Intake - Visa Debit Dispute Management Process - DRAFT.docx
+++ b/Dispute Resolution/Stage 1 Dispute Intake - Visa Debit Dispute Management Process - DRAFT.docx
@@ -1837,16 +1837,7 @@
         <w:rPr>
           <w:i/>
         </w:rPr>
-        <w:t xml:space="preserve">in line with Beem's existing member authentication procedures </w:t>
-      </w:r>
-      <w:r>
-        <w:rPr>
-          <w:b/>
-          <w:bCs/>
-          <w:i/>
-          <w:color w:val="FF0000"/>
-        </w:rPr>
-        <w:t>[TBC — reference to be confirmed]</w:t>
+        <w:t xml:space="preserve">in line with Beem’s existing member authentication procedures — the Member Connect Authentication Procedure for Contact Centre, or the Branch Authentication Procedure for Branch</w:t>
       </w:r>
       <w:r>
         <w:t>. If the member cannot be authenticated, do not proceed with intake.</w:t>

</xml_diff>